<commit_message>
Update documentation: add Docker usage instructions for running the PRO-INSECTA system
</commit_message>
<xml_diff>
--- a/Vizsgaremek_v2.docx
+++ b/Vizsgaremek_v2.docx
@@ -7409,6 +7409,110 @@
     </w:p>
     <w:p>
       <w:pPr>
+        <w:tabs>
+          <w:tab w:val="left" w:pos="425"/>
+          <w:tab w:val="left" w:pos="1418"/>
+        </w:tabs>
+        <w:rPr>
+          <w:rStyle w:val="Ershangslyozs"/>
+          <w:b/>
+          <w:i w:val="0"/>
+          <w:iCs w:val="0"/>
+          <w:color w:val="auto"/>
+        </w:rPr>
+      </w:pPr>
+      <w:r>
+        <w:rPr>
+          <w:rStyle w:val="Ershangslyozs"/>
+          <w:b/>
+          <w:i w:val="0"/>
+          <w:iCs w:val="0"/>
+          <w:color w:val="auto"/>
+        </w:rPr>
+        <w:t>Docker alapú indítás:</w:t>
+      </w:r>
+    </w:p>
+    <w:p>
+      <w:pPr>
+        <w:tabs>
+          <w:tab w:val="left" w:pos="425"/>
+          <w:tab w:val="left" w:pos="1418"/>
+        </w:tabs>
+        <w:rPr>
+          <w:rFonts w:cstheme="minorHAnsi"/>
+          <w:color w:val="1F2328"/>
+          <w:sz w:val="22"/>
+          <w:shd w:val="clear" w:color="auto" w:fill="FFFFFF"/>
+        </w:rPr>
+      </w:pPr>
+      <w:r>
+        <w:rPr>
+          <w:rFonts w:cstheme="minorHAnsi"/>
+          <w:color w:val="1F2328"/>
+          <w:sz w:val="22"/>
+          <w:shd w:val="clear" w:color="auto" w:fill="FFFFFF"/>
+        </w:rPr>
+        <w:t>A PRO</w:t>
+      </w:r>
+      <w:r>
+        <w:rPr>
+          <w:rFonts w:cstheme="minorHAnsi"/>
+          <w:color w:val="1F2328"/>
+          <w:sz w:val="22"/>
+          <w:shd w:val="clear" w:color="auto" w:fill="FFFFFF"/>
+        </w:rPr>
+        <w:noBreakHyphen/>
+        <w:t>INSECTA rendszer teljes egészében futtatható Dockerben, így nincs szükség Pythonra, Node.js</w:t>
+      </w:r>
+      <w:r>
+        <w:rPr>
+          <w:rFonts w:cstheme="minorHAnsi"/>
+          <w:color w:val="1F2328"/>
+          <w:sz w:val="22"/>
+          <w:shd w:val="clear" w:color="auto" w:fill="FFFFFF"/>
+        </w:rPr>
+        <w:noBreakHyphen/>
+        <w:t>re vagy bármilyen helyi környezeti beállításra.</w:t>
+      </w:r>
+      <w:r>
+        <w:rPr>
+          <w:rFonts w:cstheme="minorHAnsi"/>
+          <w:color w:val="1F2328"/>
+          <w:sz w:val="22"/>
+        </w:rPr>
+        <w:br/>
+      </w:r>
+      <w:r>
+        <w:rPr>
+          <w:rFonts w:cstheme="minorHAnsi"/>
+          <w:color w:val="1F2328"/>
+          <w:sz w:val="22"/>
+          <w:shd w:val="clear" w:color="auto" w:fill="FFFFFF"/>
+        </w:rPr>
+        <w:t>Csak a </w:t>
+      </w:r>
+      <w:r>
+        <w:rPr>
+          <w:rStyle w:val="Kiemels2"/>
+          <w:rFonts w:cstheme="minorHAnsi"/>
+          <w:color w:val="1F2328"/>
+          <w:sz w:val="22"/>
+          <w:shd w:val="clear" w:color="auto" w:fill="FFFFFF"/>
+        </w:rPr>
+        <w:t>Docker Desktop</w:t>
+      </w:r>
+      <w:r>
+        <w:rPr>
+          <w:rFonts w:cstheme="minorHAnsi"/>
+          <w:color w:val="1F2328"/>
+          <w:sz w:val="22"/>
+          <w:shd w:val="clear" w:color="auto" w:fill="FFFFFF"/>
+        </w:rPr>
+        <w:t> szükséges.</w:t>
+      </w:r>
+    </w:p>
+    <w:p>
+      <w:pPr>
         <w:shd w:val="clear" w:color="auto" w:fill="AEAAAA" w:themeFill="background2" w:themeFillShade="BF"/>
         <w:tabs>
           <w:tab w:val="left" w:pos="425"/>
@@ -7450,6 +7554,54 @@
           <w:color w:val="FFFFFF" w:themeColor="background1"/>
         </w:rPr>
         <w:t>bat</w:t>
+      </w:r>
+    </w:p>
+    <w:p>
+      <w:pPr>
+        <w:tabs>
+          <w:tab w:val="left" w:pos="425"/>
+          <w:tab w:val="left" w:pos="1418"/>
+        </w:tabs>
+        <w:rPr>
+          <w:rStyle w:val="Ershangslyozs"/>
+          <w:i w:val="0"/>
+          <w:iCs w:val="0"/>
+          <w:color w:val="auto"/>
+        </w:rPr>
+      </w:pPr>
+      <w:r>
+        <w:rPr>
+          <w:rStyle w:val="Ershangslyozs"/>
+          <w:i w:val="0"/>
+          <w:iCs w:val="0"/>
+          <w:color w:val="auto"/>
+        </w:rPr>
+        <w:t>Vagy a program gyökerében:</w:t>
+      </w:r>
+    </w:p>
+    <w:p>
+      <w:pPr>
+        <w:shd w:val="clear" w:color="auto" w:fill="AEAAAA" w:themeFill="background2" w:themeFillShade="BF"/>
+        <w:tabs>
+          <w:tab w:val="left" w:pos="425"/>
+          <w:tab w:val="left" w:pos="1418"/>
+        </w:tabs>
+        <w:ind w:left="709" w:hanging="1"/>
+        <w:rPr>
+          <w:rStyle w:val="Ershangslyozs"/>
+          <w:i w:val="0"/>
+          <w:iCs w:val="0"/>
+          <w:color w:val="FFFFFF" w:themeColor="background1"/>
+        </w:rPr>
+      </w:pPr>
+      <w:r>
+        <w:rPr>
+          <w:rStyle w:val="Ershangslyozs"/>
+          <w:i w:val="0"/>
+          <w:iCs w:val="0"/>
+          <w:color w:val="FFFFFF" w:themeColor="background1"/>
+        </w:rPr>
+        <w:t>docker-compose up --build</w:t>
       </w:r>
     </w:p>
     <w:p>
@@ -8570,6 +8722,7 @@
           <w:rFonts w:ascii="Consolas" w:hAnsi="Consolas"/>
           <w:color w:val="FFFFFF" w:themeColor="background1"/>
         </w:rPr>
+        <w:lastRenderedPageBreak/>
         <w:t>pip</w:t>
       </w:r>
       <w:r>
@@ -8684,7 +8837,6 @@
         </w:rPr>
       </w:pPr>
       <w:r>
-        <w:lastRenderedPageBreak/>
         <w:t>Backend indítása</w:t>
       </w:r>
     </w:p>
@@ -10336,6 +10488,7 @@
         <w:rPr>
           <w:lang w:eastAsia="hu-HU"/>
         </w:rPr>
+        <w:lastRenderedPageBreak/>
         <w:t>Activities</w:t>
       </w:r>
     </w:p>
@@ -11366,6 +11519,7 @@
       </w:pPr>
       <w:bookmarkStart w:id="458" w:name="_Toc226938900"/>
       <w:r>
+        <w:lastRenderedPageBreak/>
         <w:t>T</w:t>
       </w:r>
       <w:r>
@@ -11479,7 +11633,6 @@
           <w:noProof/>
           <w:lang w:eastAsia="hu-HU"/>
         </w:rPr>
-        <w:lastRenderedPageBreak/>
         <w:drawing>
           <wp:anchor distT="0" distB="0" distL="114300" distR="114300" simplePos="0" relativeHeight="251668480" behindDoc="1" locked="0" layoutInCell="1" allowOverlap="1">
             <wp:simplePos x="0" y="0"/>
@@ -11804,6 +11957,7 @@
           <w:noProof/>
           <w:lang w:eastAsia="hu-HU"/>
         </w:rPr>
+        <w:lastRenderedPageBreak/>
         <w:drawing>
           <wp:anchor distT="0" distB="0" distL="114300" distR="114300" simplePos="0" relativeHeight="251667456" behindDoc="1" locked="0" layoutInCell="1" allowOverlap="1">
             <wp:simplePos x="0" y="0"/>
@@ -12669,7 +12823,6 @@
         <w:ind w:left="714" w:hanging="357"/>
       </w:pPr>
       <w:r>
-        <w:lastRenderedPageBreak/>
         <w:t>kijelentkezésért,</w:t>
       </w:r>
     </w:p>
@@ -13015,6 +13168,7 @@
           <w:b/>
           <w:bCs/>
         </w:rPr>
+        <w:lastRenderedPageBreak/>
         <w:t>Összecsukható / kinyitható sidebar</w:t>
       </w:r>
     </w:p>
@@ -13626,6 +13780,7 @@
           <w:sz w:val="28"/>
           <w:szCs w:val="28"/>
         </w:rPr>
+        <w:lastRenderedPageBreak/>
         <w:t>Funkciók:</w:t>
       </w:r>
     </w:p>
@@ -13771,7 +13926,6 @@
           <w:noProof/>
           <w:lang w:eastAsia="hu-HU"/>
         </w:rPr>
-        <w:lastRenderedPageBreak/>
         <w:drawing>
           <wp:inline distT="0" distB="0" distL="0" distR="0">
             <wp:extent cx="5760720" cy="3750945"/>

</xml_diff>

<commit_message>
Add Playwright installation step for Chromium in setup instructions
</commit_message>
<xml_diff>
--- a/Vizsgaremek_v2.docx
+++ b/Vizsgaremek_v2.docx
@@ -8744,6 +8744,25 @@
     </w:p>
     <w:p>
       <w:pPr>
+        <w:shd w:val="clear" w:color="auto" w:fill="AEAAAA" w:themeFill="background2" w:themeFillShade="BF"/>
+        <w:ind w:left="709"/>
+        <w:rPr>
+          <w:rStyle w:val="Kiemels2"/>
+          <w:rFonts w:ascii="Consolas" w:hAnsi="Consolas"/>
+          <w:color w:val="FFFFFF" w:themeColor="background1"/>
+        </w:rPr>
+      </w:pPr>
+      <w:r>
+        <w:rPr>
+          <w:rStyle w:val="Kiemels2"/>
+          <w:rFonts w:ascii="Consolas" w:hAnsi="Consolas"/>
+          <w:color w:val="FFFFFF" w:themeColor="background1"/>
+        </w:rPr>
+        <w:t>playwright install chromium</w:t>
+      </w:r>
+    </w:p>
+    <w:p>
+      <w:pPr>
         <w:pStyle w:val="Listaszerbekezds"/>
         <w:numPr>
           <w:ilvl w:val="0"/>
@@ -10466,6 +10485,7 @@
         <w:rPr>
           <w:lang w:eastAsia="hu-HU"/>
         </w:rPr>
+        <w:lastRenderedPageBreak/>
         <w:t>Notes</w:t>
       </w:r>
     </w:p>
@@ -10488,7 +10508,6 @@
         <w:rPr>
           <w:lang w:eastAsia="hu-HU"/>
         </w:rPr>
-        <w:lastRenderedPageBreak/>
         <w:t>Activities</w:t>
       </w:r>
     </w:p>
@@ -11519,7 +11538,6 @@
       </w:pPr>
       <w:bookmarkStart w:id="458" w:name="_Toc226938900"/>
       <w:r>
-        <w:lastRenderedPageBreak/>
         <w:t>T</w:t>
       </w:r>
       <w:r>

</xml_diff>